<commit_message>
Add signature questions section to Episode 1 interview plan
Co-Authored-By: Claude Opus 5.5 <noreply@anthropic.com>
Claude-Session: https://claude.ai/code/session_011JLPhNgkizAQQVaskFHXaY
</commit_message>
<xml_diff>
--- a/research-prompts/Episode-01-Siddharth-Rajsekar-Interview-Plan.docx
+++ b/research-prompts/Episode-01-Siddharth-Rajsekar-Interview-Plan.docx
@@ -334,7 +334,7 @@
             <w:pPr>
               <w:spacing w:after="0"/>
             </w:pPr>
-            <w:hyperlink w:history="1" r:id="rIdmhi17kl_2gqv7_thntlzy">
+            <w:hyperlink w:history="1" r:id="rIdr805mncgcvdmwbqjppsqd">
               <w:r>
                 <w:rPr>
                   <w:rStyle w:val="Hyperlink"/>
@@ -469,7 +469,7 @@
             <w:pPr>
               <w:spacing w:after="0"/>
             </w:pPr>
-            <w:hyperlink w:history="1" r:id="rIdzsex6d-fnliy3xo2oiwq2">
+            <w:hyperlink w:history="1" r:id="rIdtmyd-qjdd0srfd6idpf5w">
               <w:r>
                 <w:rPr>
                   <w:rStyle w:val="Hyperlink"/>
@@ -3625,6 +3625,883 @@
           <w:rFonts w:ascii="Calibri" w:cs="Calibri" w:eastAsia="Calibri" w:hAnsi="Calibri"/>
         </w:rPr>
         <w:t xml:space="preserve">, the way SOHK's first big interview led to others.</w:t>
+      </w:r>
+    </w:p>
+    <w:p>
+      <w:pPr>
+        <w:pStyle w:val="Heading1"/>
+      </w:pPr>
+      <w:r>
+        <w:t xml:space="preserve">9. Signature questions: the ones nobody else asks</w:t>
+      </w:r>
+    </w:p>
+    <w:p>
+      <w:pPr>
+        <w:spacing w:after="120"/>
+      </w:pPr>
+      <w:r>
+        <w:rPr>
+          <w:rFonts w:ascii="Calibri" w:cs="Calibri" w:eastAsia="Calibri" w:hAnsi="Calibri"/>
+        </w:rPr>
+        <w:t xml:space="preserve">These are built from his </w:t>
+      </w:r>
+      <w:r>
+        <w:rPr>
+          <w:rFonts w:ascii="Calibri" w:cs="Calibri" w:eastAsia="Calibri" w:hAnsi="Calibri"/>
+          <w:i/>
+          <w:iCs/>
+        </w:rPr>
+        <w:t xml:space="preserve">own</w:t>
+      </w:r>
+      <w:r>
+        <w:rPr>
+          <w:rFonts w:ascii="Calibri" w:cs="Calibri" w:eastAsia="Calibri" w:hAnsi="Calibri"/>
+        </w:rPr>
+        <w:t xml:space="preserve"> story and frameworks, so no other interviewer can ask them the same way. Each one sets up a </w:t>
+      </w:r>
+      <w:r>
+        <w:rPr>
+          <w:rFonts w:ascii="Calibri" w:cs="Calibri" w:eastAsia="Calibri" w:hAnsi="Calibri"/>
+          <w:b/>
+          <w:bCs/>
+        </w:rPr>
+        <w:t xml:space="preserve">tension</w:t>
+      </w:r>
+      <w:r>
+        <w:rPr>
+          <w:rFonts w:ascii="Calibri" w:cs="Calibri" w:eastAsia="Calibri" w:hAnsi="Calibri"/>
+        </w:rPr>
+        <w:t xml:space="preserve"> (a paradox, a thought experiment or a reversal) that he has to think through live, and that thinking-on-camera is what makes a clip worth sharing.</w:t>
+      </w:r>
+    </w:p>
+    <w:p>
+      <w:pPr>
+        <w:spacing w:after="120"/>
+      </w:pPr>
+      <w:r>
+        <w:rPr>
+          <w:rFonts w:ascii="Calibri" w:cs="Calibri" w:eastAsia="Calibri" w:hAnsi="Calibri"/>
+          <w:b/>
+          <w:bCs/>
+        </w:rPr>
+        <w:t xml:space="preserve">Pick the 5 marked ★ if you can only use five.</w:t>
+      </w:r>
+      <w:r>
+        <w:rPr>
+          <w:rFonts w:ascii="Calibri" w:cs="Calibri" w:eastAsia="Calibri" w:hAnsi="Calibri"/>
+        </w:rPr>
+        <w:t xml:space="preserve"> Ask the ones marked ⚠ gently and near the end, once there's trust. Tell him beforehand: "A few questions will be unusual. You can skip any of them."</w:t>
+      </w:r>
+    </w:p>
+    <w:p>
+      <w:pPr>
+        <w:pStyle w:val="Heading2"/>
+      </w:pPr>
+      <w:r>
+        <w:t xml:space="preserve">A. Paradoxes (tensions inside his own story)</w:t>
+      </w:r>
+    </w:p>
+    <w:p>
+      <w:pPr>
+        <w:spacing w:after="60"/>
+        <w:ind w:left="360" w:hanging="360"/>
+      </w:pPr>
+      <w:r>
+        <w:rPr>
+          <w:rFonts w:ascii="Calibri" w:cs="Calibri" w:eastAsia="Calibri" w:hAnsi="Calibri"/>
+          <w:b/>
+          <w:bCs/>
+          <w:color w:val="1F3A5F"/>
+        </w:rPr>
+        <w:t xml:space="preserve">1.  </w:t>
+      </w:r>
+      <w:r>
+        <w:rPr>
+          <w:rFonts w:ascii="Calibri" w:cs="Calibri" w:eastAsia="Calibri" w:hAnsi="Calibri"/>
+        </w:rPr>
+        <w:t xml:space="preserve">★ </w:t>
+      </w:r>
+      <w:r>
+        <w:rPr>
+          <w:rFonts w:ascii="Calibri" w:cs="Calibri" w:eastAsia="Calibri" w:hAnsi="Calibri"/>
+          <w:b/>
+          <w:bCs/>
+        </w:rPr>
+        <w:t xml:space="preserve">"Gurukuls ran on guru dakshina: the student paid only after the learning was complete. If ILH ran on guru dakshina tomorrow, paying only after results, would it survive?"</w:t>
+      </w:r>
+    </w:p>
+    <w:p>
+      <w:pPr>
+        <w:spacing w:after="60"/>
+        <w:ind w:left="360" w:hanging="360"/>
+      </w:pPr>
+      <w:r>
+        <w:rPr>
+          <w:rFonts w:ascii="Calibri" w:cs="Calibri" w:eastAsia="Calibri" w:hAnsi="Calibri"/>
+          <w:b/>
+          <w:bCs/>
+          <w:color w:val="1F3A5F"/>
+        </w:rPr>
+        <w:t xml:space="preserve">2.  </w:t>
+      </w:r>
+      <w:r>
+        <w:rPr>
+          <w:rFonts w:ascii="Calibri" w:cs="Calibri" w:eastAsia="Calibri" w:hAnsi="Calibri"/>
+        </w:rPr>
+        <w:t xml:space="preserve">★ </w:t>
+      </w:r>
+      <w:r>
+        <w:rPr>
+          <w:rFonts w:ascii="Calibri" w:cs="Calibri" w:eastAsia="Calibri" w:hAnsi="Calibri"/>
+          <w:b/>
+          <w:bCs/>
+        </w:rPr>
+        <w:t xml:space="preserve">"The Gita says you have a right to action, not to its fruits. Your community tracks ₹1,500 crore of fruits. How do you measure results without becoming attached to them?"</w:t>
+      </w:r>
+      <w:r>
+        <w:rPr>
+          <w:rFonts w:ascii="Calibri" w:cs="Calibri" w:eastAsia="Calibri" w:hAnsi="Calibri"/>
+        </w:rPr>
+        <w:t xml:space="preserve"> (This is the verse on your own website, so it doubles as your brand moment.)</w:t>
+      </w:r>
+    </w:p>
+    <w:p>
+      <w:pPr>
+        <w:spacing w:after="60"/>
+        <w:ind w:left="360" w:hanging="360"/>
+      </w:pPr>
+      <w:r>
+        <w:rPr>
+          <w:rFonts w:ascii="Calibri" w:cs="Calibri" w:eastAsia="Calibri" w:hAnsi="Calibri"/>
+          <w:b/>
+          <w:bCs/>
+          <w:color w:val="1F3A5F"/>
+        </w:rPr>
+        <w:t xml:space="preserve">3.  </w:t>
+      </w:r>
+      <w:r>
+        <w:rPr>
+          <w:rFonts w:ascii="Calibri" w:cs="Calibri" w:eastAsia="Calibri" w:hAnsi="Calibri"/>
+        </w:rPr>
+        <w:t xml:space="preserve">"You failed an exam system and now you design learning programmes. Which part of ILH would 17-year-old Siddharth have hated?"</w:t>
+      </w:r>
+    </w:p>
+    <w:p>
+      <w:pPr>
+        <w:spacing w:after="60"/>
+        <w:ind w:left="360" w:hanging="360"/>
+      </w:pPr>
+      <w:r>
+        <w:rPr>
+          <w:rFonts w:ascii="Calibri" w:cs="Calibri" w:eastAsia="Calibri" w:hAnsi="Calibri"/>
+          <w:b/>
+          <w:bCs/>
+          <w:color w:val="1F3A5F"/>
+        </w:rPr>
+        <w:t xml:space="preserve">4.  </w:t>
+      </w:r>
+      <w:r>
+        <w:rPr>
+          <w:rFonts w:ascii="Calibri" w:cs="Calibri" w:eastAsia="Calibri" w:hAnsi="Calibri"/>
+        </w:rPr>
+        <w:t xml:space="preserve">"Your book says </w:t>
+      </w:r>
+      <w:r>
+        <w:rPr>
+          <w:rFonts w:ascii="Calibri" w:cs="Calibri" w:eastAsia="Calibri" w:hAnsi="Calibri"/>
+          <w:i/>
+          <w:iCs/>
+        </w:rPr>
+        <w:t xml:space="preserve">You Can Coach</w:t>
+      </w:r>
+      <w:r>
+        <w:rPr>
+          <w:rFonts w:ascii="Calibri" w:cs="Calibri" w:eastAsia="Calibri" w:hAnsi="Calibri"/>
+        </w:rPr>
+        <w:t xml:space="preserve">. What percentage of people should </w:t>
+      </w:r>
+      <w:r>
+        <w:rPr>
+          <w:rFonts w:ascii="Calibri" w:cs="Calibri" w:eastAsia="Calibri" w:hAnsi="Calibri"/>
+          <w:i/>
+          <w:iCs/>
+        </w:rPr>
+        <w:t xml:space="preserve">not</w:t>
+      </w:r>
+      <w:r>
+        <w:rPr>
+          <w:rFonts w:ascii="Calibri" w:cs="Calibri" w:eastAsia="Calibri" w:hAnsi="Calibri"/>
+        </w:rPr>
+        <w:t xml:space="preserve"> coach, and do you ever tell them?"</w:t>
+      </w:r>
+    </w:p>
+    <w:p>
+      <w:pPr>
+        <w:spacing w:after="60"/>
+        <w:ind w:left="360" w:hanging="360"/>
+      </w:pPr>
+      <w:r>
+        <w:rPr>
+          <w:rFonts w:ascii="Calibri" w:cs="Calibri" w:eastAsia="Calibri" w:hAnsi="Calibri"/>
+          <w:b/>
+          <w:bCs/>
+          <w:color w:val="1F3A5F"/>
+        </w:rPr>
+        <w:t xml:space="preserve">5.  </w:t>
+      </w:r>
+      <w:r>
+        <w:rPr>
+          <w:rFonts w:ascii="Calibri" w:cs="Calibri" w:eastAsia="Calibri" w:hAnsi="Calibri"/>
+        </w:rPr>
+        <w:t xml:space="preserve">"Omega Shift is anti-hustle, but your own story looks like hustle. Is the Omega Shift something you can only afford </w:t>
+      </w:r>
+      <w:r>
+        <w:rPr>
+          <w:rFonts w:ascii="Calibri" w:cs="Calibri" w:eastAsia="Calibri" w:hAnsi="Calibri"/>
+          <w:i/>
+          <w:iCs/>
+        </w:rPr>
+        <w:t xml:space="preserve">after</w:t>
+      </w:r>
+      <w:r>
+        <w:rPr>
+          <w:rFonts w:ascii="Calibri" w:cs="Calibri" w:eastAsia="Calibri" w:hAnsi="Calibri"/>
+        </w:rPr>
+        <w:t xml:space="preserve"> the hustle?"</w:t>
+      </w:r>
+    </w:p>
+    <w:p>
+      <w:pPr>
+        <w:pStyle w:val="Heading2"/>
+      </w:pPr>
+      <w:r>
+        <w:t xml:space="preserve">B. Thought experiments</w:t>
+      </w:r>
+    </w:p>
+    <w:p>
+      <w:pPr>
+        <w:spacing w:after="60"/>
+        <w:ind w:left="360" w:hanging="360"/>
+      </w:pPr>
+      <w:r>
+        <w:rPr>
+          <w:rFonts w:ascii="Calibri" w:cs="Calibri" w:eastAsia="Calibri" w:hAnsi="Calibri"/>
+          <w:b/>
+          <w:bCs/>
+          <w:color w:val="1F3A5F"/>
+        </w:rPr>
+        <w:t xml:space="preserve">6.  </w:t>
+      </w:r>
+      <w:r>
+        <w:rPr>
+          <w:rFonts w:ascii="Calibri" w:cs="Calibri" w:eastAsia="Calibri" w:hAnsi="Calibri"/>
+        </w:rPr>
+        <w:t xml:space="preserve">★ </w:t>
+      </w:r>
+      <w:r>
+        <w:rPr>
+          <w:rFonts w:ascii="Calibri" w:cs="Calibri" w:eastAsia="Calibri" w:hAnsi="Calibri"/>
+          <w:b/>
+          <w:bCs/>
+        </w:rPr>
+        <w:t xml:space="preserve">"An AI clone of you, trained on every video you've ever made, runs ILH for one year. What does it get right, and what's the one thing it gets dangerously wrong?"</w:t>
+      </w:r>
+      <w:r>
+        <w:rPr>
+          <w:rFonts w:ascii="Calibri" w:cs="Calibri" w:eastAsia="Calibri" w:hAnsi="Calibri"/>
+        </w:rPr>
+        <w:t xml:space="preserve"> (This question is where your AI niche and his wisdom meet.)</w:t>
+      </w:r>
+    </w:p>
+    <w:p>
+      <w:pPr>
+        <w:spacing w:after="60"/>
+        <w:ind w:left="360" w:hanging="360"/>
+      </w:pPr>
+      <w:r>
+        <w:rPr>
+          <w:rFonts w:ascii="Calibri" w:cs="Calibri" w:eastAsia="Calibri" w:hAnsi="Calibri"/>
+          <w:b/>
+          <w:bCs/>
+          <w:color w:val="1F3A5F"/>
+        </w:rPr>
+        <w:t xml:space="preserve">7.  </w:t>
+      </w:r>
+      <w:r>
+        <w:rPr>
+          <w:rFonts w:ascii="Calibri" w:cs="Calibri" w:eastAsia="Calibri" w:hAnsi="Calibri"/>
+        </w:rPr>
+        <w:t xml:space="preserve">"Rebuild from zero in Mumbai: no name, no audience, ₹10,000, and you're </w:t>
+      </w:r>
+      <w:r>
+        <w:rPr>
+          <w:rFonts w:ascii="Calibri" w:cs="Calibri" w:eastAsia="Calibri" w:hAnsi="Calibri"/>
+          <w:i/>
+          <w:iCs/>
+        </w:rPr>
+        <w:t xml:space="preserve">not allowed to teach coaching</w:t>
+      </w:r>
+      <w:r>
+        <w:rPr>
+          <w:rFonts w:ascii="Calibri" w:cs="Calibri" w:eastAsia="Calibri" w:hAnsi="Calibri"/>
+        </w:rPr>
+        <w:t xml:space="preserve">. What do you build?"</w:t>
+      </w:r>
+    </w:p>
+    <w:p>
+      <w:pPr>
+        <w:spacing w:after="60"/>
+        <w:ind w:left="360" w:hanging="360"/>
+      </w:pPr>
+      <w:r>
+        <w:rPr>
+          <w:rFonts w:ascii="Calibri" w:cs="Calibri" w:eastAsia="Calibri" w:hAnsi="Calibri"/>
+          <w:b/>
+          <w:bCs/>
+          <w:color w:val="1F3A5F"/>
+        </w:rPr>
+        <w:t xml:space="preserve">8.  </w:t>
+      </w:r>
+      <w:r>
+        <w:rPr>
+          <w:rFonts w:ascii="Calibri" w:cs="Calibri" w:eastAsia="Calibri" w:hAnsi="Calibri"/>
+        </w:rPr>
+        <w:t xml:space="preserve">"What would have to be true for you to shut ILH down?"</w:t>
+      </w:r>
+    </w:p>
+    <w:p>
+      <w:pPr>
+        <w:spacing w:after="60"/>
+        <w:ind w:left="360" w:hanging="360"/>
+      </w:pPr>
+      <w:r>
+        <w:rPr>
+          <w:rFonts w:ascii="Calibri" w:cs="Calibri" w:eastAsia="Calibri" w:hAnsi="Calibri"/>
+          <w:b/>
+          <w:bCs/>
+          <w:color w:val="1F3A5F"/>
+        </w:rPr>
+        <w:t xml:space="preserve">9.  </w:t>
+      </w:r>
+      <w:r>
+        <w:rPr>
+          <w:rFonts w:ascii="Calibri" w:cs="Calibri" w:eastAsia="Calibri" w:hAnsi="Calibri"/>
+        </w:rPr>
+        <w:t xml:space="preserve">"If ILH disappeared tomorrow, which member's life would change the </w:t>
+      </w:r>
+      <w:r>
+        <w:rPr>
+          <w:rFonts w:ascii="Calibri" w:cs="Calibri" w:eastAsia="Calibri" w:hAnsi="Calibri"/>
+          <w:i/>
+          <w:iCs/>
+        </w:rPr>
+        <w:t xml:space="preserve">least</w:t>
+      </w:r>
+      <w:r>
+        <w:rPr>
+          <w:rFonts w:ascii="Calibri" w:cs="Calibri" w:eastAsia="Calibri" w:hAnsi="Calibri"/>
+        </w:rPr>
+        <w:t xml:space="preserve">, and what does that tell you?"</w:t>
+      </w:r>
+    </w:p>
+    <w:p>
+      <w:pPr>
+        <w:spacing w:after="60"/>
+        <w:ind w:left="360" w:hanging="360"/>
+      </w:pPr>
+      <w:r>
+        <w:rPr>
+          <w:rFonts w:ascii="Calibri" w:cs="Calibri" w:eastAsia="Calibri" w:hAnsi="Calibri"/>
+          <w:b/>
+          <w:bCs/>
+          <w:color w:val="1F3A5F"/>
+        </w:rPr>
+        <w:t xml:space="preserve">10.  </w:t>
+      </w:r>
+      <w:r>
+        <w:rPr>
+          <w:rFonts w:ascii="Calibri" w:cs="Calibri" w:eastAsia="Calibri" w:hAnsi="Calibri"/>
+        </w:rPr>
+        <w:t xml:space="preserve">★ *</w:t>
+      </w:r>
+      <w:r>
+        <w:rPr>
+          <w:rFonts w:ascii="Calibri" w:cs="Calibri" w:eastAsia="Calibri" w:hAnsi="Calibri"/>
+          <w:i/>
+          <w:iCs/>
+        </w:rPr>
+        <w:t xml:space="preserve">"You can send one 30-second voice note to the Siddharth who just lost his job in Bangalore. What do you say, and what do you deliberately </w:t>
+      </w:r>
+      <w:r>
+        <w:rPr>
+          <w:rFonts w:ascii="Calibri" w:cs="Calibri" w:eastAsia="Calibri" w:hAnsi="Calibri"/>
+        </w:rPr>
+        <w:t xml:space="preserve">not* tell him?"**</w:t>
+      </w:r>
+    </w:p>
+    <w:p>
+      <w:pPr>
+        <w:pStyle w:val="Heading2"/>
+      </w:pPr>
+      <w:r>
+        <w:t xml:space="preserve">C. Hidden mechanics (things only an insider would know)</w:t>
+      </w:r>
+    </w:p>
+    <w:p>
+      <w:pPr>
+        <w:spacing w:after="60"/>
+        <w:ind w:left="360" w:hanging="360"/>
+      </w:pPr>
+      <w:r>
+        <w:rPr>
+          <w:rFonts w:ascii="Calibri" w:cs="Calibri" w:eastAsia="Calibri" w:hAnsi="Calibri"/>
+          <w:b/>
+          <w:bCs/>
+          <w:color w:val="1F3A5F"/>
+        </w:rPr>
+        <w:t xml:space="preserve">11.  </w:t>
+      </w:r>
+      <w:r>
+        <w:rPr>
+          <w:rFonts w:ascii="Calibri" w:cs="Calibri" w:eastAsia="Calibri" w:hAnsi="Calibri"/>
+        </w:rPr>
+        <w:t xml:space="preserve">"What's one number you track that nobody else in the coaching industry tracks?"</w:t>
+      </w:r>
+    </w:p>
+    <w:p>
+      <w:pPr>
+        <w:spacing w:after="60"/>
+        <w:ind w:left="360" w:hanging="360"/>
+      </w:pPr>
+      <w:r>
+        <w:rPr>
+          <w:rFonts w:ascii="Calibri" w:cs="Calibri" w:eastAsia="Calibri" w:hAnsi="Calibri"/>
+          <w:b/>
+          <w:bCs/>
+          <w:color w:val="1F3A5F"/>
+        </w:rPr>
+        <w:t xml:space="preserve">12.  </w:t>
+      </w:r>
+      <w:r>
+        <w:rPr>
+          <w:rFonts w:ascii="Calibri" w:cs="Calibri" w:eastAsia="Calibri" w:hAnsi="Calibri"/>
+        </w:rPr>
+        <w:t xml:space="preserve">"What do your successful members do in their </w:t>
+      </w:r>
+      <w:r>
+        <w:rPr>
+          <w:rFonts w:ascii="Calibri" w:cs="Calibri" w:eastAsia="Calibri" w:hAnsi="Calibri"/>
+          <w:i/>
+          <w:iCs/>
+        </w:rPr>
+        <w:t xml:space="preserve">first week</w:t>
+      </w:r>
+      <w:r>
+        <w:rPr>
+          <w:rFonts w:ascii="Calibri" w:cs="Calibri" w:eastAsia="Calibri" w:hAnsi="Calibri"/>
+        </w:rPr>
+        <w:t xml:space="preserve"> that the others don't?"</w:t>
+      </w:r>
+    </w:p>
+    <w:p>
+      <w:pPr>
+        <w:spacing w:after="60"/>
+        <w:ind w:left="360" w:hanging="360"/>
+      </w:pPr>
+      <w:r>
+        <w:rPr>
+          <w:rFonts w:ascii="Calibri" w:cs="Calibri" w:eastAsia="Calibri" w:hAnsi="Calibri"/>
+          <w:b/>
+          <w:bCs/>
+          <w:color w:val="1F3A5F"/>
+        </w:rPr>
+        <w:t xml:space="preserve">13.  </w:t>
+      </w:r>
+      <w:r>
+        <w:rPr>
+          <w:rFonts w:ascii="Calibri" w:cs="Calibri" w:eastAsia="Calibri" w:hAnsi="Calibri"/>
+        </w:rPr>
+        <w:t xml:space="preserve">"Which belief you held in 2018 turned out to be completely wrong?"</w:t>
+      </w:r>
+    </w:p>
+    <w:p>
+      <w:pPr>
+        <w:spacing w:after="60"/>
+        <w:ind w:left="360" w:hanging="360"/>
+      </w:pPr>
+      <w:r>
+        <w:rPr>
+          <w:rFonts w:ascii="Calibri" w:cs="Calibri" w:eastAsia="Calibri" w:hAnsi="Calibri"/>
+          <w:b/>
+          <w:bCs/>
+          <w:color w:val="1F3A5F"/>
+        </w:rPr>
+        <w:t xml:space="preserve">14.  </w:t>
+      </w:r>
+      <w:r>
+        <w:rPr>
+          <w:rFonts w:ascii="Calibri" w:cs="Calibri" w:eastAsia="Calibri" w:hAnsi="Calibri"/>
+        </w:rPr>
+        <w:t xml:space="preserve">"You started in music. What does a great course have in common with a great song: the hook, the chorus, the rhythm?"</w:t>
+      </w:r>
+    </w:p>
+    <w:p>
+      <w:pPr>
+        <w:pStyle w:val="Heading2"/>
+      </w:pPr>
+      <w:r>
+        <w:t xml:space="preserve">D. Ego and honesty (⚠ ask near the end)</w:t>
+      </w:r>
+    </w:p>
+    <w:p>
+      <w:pPr>
+        <w:spacing w:after="60"/>
+        <w:ind w:left="360" w:hanging="360"/>
+      </w:pPr>
+      <w:r>
+        <w:rPr>
+          <w:rFonts w:ascii="Calibri" w:cs="Calibri" w:eastAsia="Calibri" w:hAnsi="Calibri"/>
+          <w:b/>
+          <w:bCs/>
+          <w:color w:val="1F3A5F"/>
+        </w:rPr>
+        <w:t xml:space="preserve">15.  </w:t>
+      </w:r>
+      <w:r>
+        <w:rPr>
+          <w:rFonts w:ascii="Calibri" w:cs="Calibri" w:eastAsia="Calibri" w:hAnsi="Calibri"/>
+        </w:rPr>
+        <w:t xml:space="preserve">⚠ "When did you last feel like a fraud?"</w:t>
+      </w:r>
+    </w:p>
+    <w:p>
+      <w:pPr>
+        <w:spacing w:after="60"/>
+        <w:ind w:left="360" w:hanging="360"/>
+      </w:pPr>
+      <w:r>
+        <w:rPr>
+          <w:rFonts w:ascii="Calibri" w:cs="Calibri" w:eastAsia="Calibri" w:hAnsi="Calibri"/>
+          <w:b/>
+          <w:bCs/>
+          <w:color w:val="1F3A5F"/>
+        </w:rPr>
+        <w:t xml:space="preserve">16.  </w:t>
+      </w:r>
+      <w:r>
+        <w:rPr>
+          <w:rFonts w:ascii="Calibri" w:cs="Calibri" w:eastAsia="Calibri" w:hAnsi="Calibri"/>
+        </w:rPr>
+        <w:t xml:space="preserve">⚠ "Which critic of yours do you secretly think is right?"</w:t>
+      </w:r>
+    </w:p>
+    <w:p>
+      <w:pPr>
+        <w:spacing w:after="60"/>
+        <w:ind w:left="360" w:hanging="360"/>
+      </w:pPr>
+      <w:r>
+        <w:rPr>
+          <w:rFonts w:ascii="Calibri" w:cs="Calibri" w:eastAsia="Calibri" w:hAnsi="Calibri"/>
+          <w:b/>
+          <w:bCs/>
+          <w:color w:val="1F3A5F"/>
+        </w:rPr>
+        <w:t xml:space="preserve">17.  </w:t>
+      </w:r>
+      <w:r>
+        <w:rPr>
+          <w:rFonts w:ascii="Calibri" w:cs="Calibri" w:eastAsia="Calibri" w:hAnsi="Calibri"/>
+        </w:rPr>
+        <w:t xml:space="preserve">⚠ "What would Jayapataka Swami say about your marketing?"</w:t>
+      </w:r>
+    </w:p>
+    <w:p>
+      <w:pPr>
+        <w:spacing w:after="60"/>
+        <w:ind w:left="360" w:hanging="360"/>
+      </w:pPr>
+      <w:r>
+        <w:rPr>
+          <w:rFonts w:ascii="Calibri" w:cs="Calibri" w:eastAsia="Calibri" w:hAnsi="Calibri"/>
+          <w:b/>
+          <w:bCs/>
+          <w:color w:val="1F3A5F"/>
+        </w:rPr>
+        <w:t xml:space="preserve">18.  </w:t>
+      </w:r>
+      <w:r>
+        <w:rPr>
+          <w:rFonts w:ascii="Calibri" w:cs="Calibri" w:eastAsia="Calibri" w:hAnsi="Calibri"/>
+        </w:rPr>
+        <w:t xml:space="preserve">⚠ "Coaches are accused of selling dreams. Which dream would you take back?"</w:t>
+      </w:r>
+    </w:p>
+    <w:p>
+      <w:pPr>
+        <w:pStyle w:val="Heading2"/>
+      </w:pPr>
+      <w:r>
+        <w:t xml:space="preserve">E. The future of learning after AI</w:t>
+      </w:r>
+    </w:p>
+    <w:p>
+      <w:pPr>
+        <w:spacing w:after="60"/>
+        <w:ind w:left="360" w:hanging="360"/>
+      </w:pPr>
+      <w:r>
+        <w:rPr>
+          <w:rFonts w:ascii="Calibri" w:cs="Calibri" w:eastAsia="Calibri" w:hAnsi="Calibri"/>
+          <w:b/>
+          <w:bCs/>
+          <w:color w:val="1F3A5F"/>
+        </w:rPr>
+        <w:t xml:space="preserve">19.  </w:t>
+      </w:r>
+      <w:r>
+        <w:rPr>
+          <w:rFonts w:ascii="Calibri" w:cs="Calibri" w:eastAsia="Calibri" w:hAnsi="Calibri"/>
+        </w:rPr>
+        <w:t xml:space="preserve">"When anyone can generate a course in 10 minutes, what becomes scarce? What's the new expensive thing?"</w:t>
+      </w:r>
+    </w:p>
+    <w:p>
+      <w:pPr>
+        <w:spacing w:after="60"/>
+        <w:ind w:left="360" w:hanging="360"/>
+      </w:pPr>
+      <w:r>
+        <w:rPr>
+          <w:rFonts w:ascii="Calibri" w:cs="Calibri" w:eastAsia="Calibri" w:hAnsi="Calibri"/>
+          <w:b/>
+          <w:bCs/>
+          <w:color w:val="1F3A5F"/>
+        </w:rPr>
+        <w:t xml:space="preserve">20.  </w:t>
+      </w:r>
+      <w:r>
+        <w:rPr>
+          <w:rFonts w:ascii="Calibri" w:cs="Calibri" w:eastAsia="Calibri" w:hAnsi="Calibri"/>
+        </w:rPr>
+        <w:t xml:space="preserve">"YouTube made knowledge free. AI is making advice free. What's left to charge for?"</w:t>
+      </w:r>
+    </w:p>
+    <w:p>
+      <w:pPr>
+        <w:spacing w:after="60"/>
+        <w:ind w:left="360" w:hanging="360"/>
+      </w:pPr>
+      <w:r>
+        <w:rPr>
+          <w:rFonts w:ascii="Calibri" w:cs="Calibri" w:eastAsia="Calibri" w:hAnsi="Calibri"/>
+          <w:b/>
+          <w:bCs/>
+          <w:color w:val="1F3A5F"/>
+        </w:rPr>
+        <w:t xml:space="preserve">21.  </w:t>
+      </w:r>
+      <w:r>
+        <w:rPr>
+          <w:rFonts w:ascii="Calibri" w:cs="Calibri" w:eastAsia="Calibri" w:hAnsi="Calibri"/>
+        </w:rPr>
+        <w:t xml:space="preserve">"Will your grandchildren learn from a guru, a coach or a model, and which would you </w:t>
+      </w:r>
+      <w:r>
+        <w:rPr>
+          <w:rFonts w:ascii="Calibri" w:cs="Calibri" w:eastAsia="Calibri" w:hAnsi="Calibri"/>
+          <w:i/>
+          <w:iCs/>
+        </w:rPr>
+        <w:t xml:space="preserve">want</w:t>
+      </w:r>
+      <w:r>
+        <w:rPr>
+          <w:rFonts w:ascii="Calibri" w:cs="Calibri" w:eastAsia="Calibri" w:hAnsi="Calibri"/>
+        </w:rPr>
+        <w:t xml:space="preserve"> them to learn from?"</w:t>
+      </w:r>
+    </w:p>
+    <w:p>
+      <w:pPr>
+        <w:pStyle w:val="Heading2"/>
+      </w:pPr>
+      <w:r>
+        <w:t xml:space="preserve">F. Reversal (the closing clip)</w:t>
+      </w:r>
+    </w:p>
+    <w:p>
+      <w:pPr>
+        <w:spacing w:after="60"/>
+        <w:ind w:left="360" w:hanging="360"/>
+      </w:pPr>
+      <w:r>
+        <w:rPr>
+          <w:rFonts w:ascii="Calibri" w:cs="Calibri" w:eastAsia="Calibri" w:hAnsi="Calibri"/>
+          <w:b/>
+          <w:bCs/>
+          <w:color w:val="1F3A5F"/>
+        </w:rPr>
+        <w:t xml:space="preserve">22.  </w:t>
+      </w:r>
+      <w:r>
+        <w:rPr>
+          <w:rFonts w:ascii="Calibri" w:cs="Calibri" w:eastAsia="Calibri" w:hAnsi="Calibri"/>
+        </w:rPr>
+        <w:t xml:space="preserve">★ *</w:t>
+      </w:r>
+      <w:r>
+        <w:rPr>
+          <w:rFonts w:ascii="Calibri" w:cs="Calibri" w:eastAsia="Calibri" w:hAnsi="Calibri"/>
+          <w:i/>
+          <w:iCs/>
+        </w:rPr>
+        <w:t xml:space="preserve">"You've trained thousands of people. Ask </w:t>
+      </w:r>
+      <w:r>
+        <w:rPr>
+          <w:rFonts w:ascii="Calibri" w:cs="Calibri" w:eastAsia="Calibri" w:hAnsi="Calibri"/>
+        </w:rPr>
+        <w:t xml:space="preserve">me* one question, the one you'd ask a 20-something building AI in Mumbai."** Letting the guest interview the host is rare in Indian interviews, and it positions </w:t>
+      </w:r>
+      <w:r>
+        <w:rPr>
+          <w:rFonts w:ascii="Calibri" w:cs="Calibri" w:eastAsia="Calibri" w:hAnsi="Calibri"/>
+          <w:i/>
+          <w:iCs/>
+        </w:rPr>
+        <w:t xml:space="preserve">you</w:t>
+      </w:r>
+      <w:r>
+        <w:rPr>
+          <w:rFonts w:ascii="Calibri" w:cs="Calibri" w:eastAsia="Calibri" w:hAnsi="Calibri"/>
+        </w:rPr>
+        <w:t xml:space="preserve"> in front of his audience.</w:t>
+      </w:r>
+    </w:p>
+    <w:p>
+      <w:pPr>
+        <w:spacing w:after="60"/>
+        <w:ind w:left="360" w:hanging="360"/>
+      </w:pPr>
+      <w:r>
+        <w:rPr>
+          <w:rFonts w:ascii="Calibri" w:cs="Calibri" w:eastAsia="Calibri" w:hAnsi="Calibri"/>
+          <w:b/>
+          <w:bCs/>
+          <w:color w:val="1F3A5F"/>
+        </w:rPr>
+        <w:t xml:space="preserve">23.  </w:t>
+      </w:r>
+      <w:r>
+        <w:rPr>
+          <w:rFonts w:ascii="Calibri" w:cs="Calibri" w:eastAsia="Calibri" w:hAnsi="Calibri"/>
+        </w:rPr>
+        <w:t xml:space="preserve">Safety net: "What's the question interviewers never ask you that you wish they would?"</w:t>
+      </w:r>
+    </w:p>
+    <w:p>
+      <w:pPr>
+        <w:pStyle w:val="Heading2"/>
+      </w:pPr>
+      <w:r>
+        <w:t xml:space="preserve">How to ask them (this matters as much as the wording)</w:t>
+      </w:r>
+    </w:p>
+    <w:p>
+      <w:pPr>
+        <w:pStyle w:val="ListParagraph"/>
+        <w:numPr>
+          <w:ilvl w:val="0"/>
+          <w:numId w:val="2"/>
+        </w:numPr>
+        <w:spacing w:after="60"/>
+      </w:pPr>
+      <w:r>
+        <w:rPr>
+          <w:rFonts w:ascii="Calibri" w:cs="Calibri" w:eastAsia="Calibri" w:hAnsi="Calibri"/>
+          <w:b/>
+          <w:bCs/>
+        </w:rPr>
+        <w:t xml:space="preserve">Pause 5 seconds after he answers.</w:t>
+      </w:r>
+      <w:r>
+        <w:rPr>
+          <w:rFonts w:ascii="Calibri" w:cs="Calibri" w:eastAsia="Calibri" w:hAnsi="Calibri"/>
+        </w:rPr>
+        <w:t xml:space="preserve"> The best line often comes after the silence.</w:t>
+      </w:r>
+    </w:p>
+    <w:p>
+      <w:pPr>
+        <w:pStyle w:val="ListParagraph"/>
+        <w:numPr>
+          <w:ilvl w:val="0"/>
+          <w:numId w:val="2"/>
+        </w:numPr>
+        <w:spacing w:after="60"/>
+      </w:pPr>
+      <w:r>
+        <w:rPr>
+          <w:rFonts w:ascii="Calibri" w:cs="Calibri" w:eastAsia="Calibri" w:hAnsi="Calibri"/>
+          <w:b/>
+          <w:bCs/>
+        </w:rPr>
+        <w:t xml:space="preserve">Follow-up prompts:</w:t>
+      </w:r>
+      <w:r>
+        <w:rPr>
+          <w:rFonts w:ascii="Calibri" w:cs="Calibri" w:eastAsia="Calibri" w:hAnsi="Calibri"/>
+        </w:rPr>
+        <w:t xml:space="preserve"> "Say more." · "What did that cost you?" · "Give me one real example." · "Are you sure?"</w:t>
+      </w:r>
+    </w:p>
+    <w:p>
+      <w:pPr>
+        <w:pStyle w:val="ListParagraph"/>
+        <w:numPr>
+          <w:ilvl w:val="0"/>
+          <w:numId w:val="2"/>
+        </w:numPr>
+        <w:spacing w:after="60"/>
+      </w:pPr>
+      <w:r>
+        <w:rPr>
+          <w:rFonts w:ascii="Calibri" w:cs="Calibri" w:eastAsia="Calibri" w:hAnsi="Calibri"/>
+          <w:b/>
+          <w:bCs/>
+        </w:rPr>
+        <w:t xml:space="preserve">Keep the questions short and read them word for word.</w:t>
+      </w:r>
+      <w:r>
+        <w:rPr>
+          <w:rFonts w:ascii="Calibri" w:cs="Calibri" w:eastAsia="Calibri" w:hAnsi="Calibri"/>
+        </w:rPr>
+        <w:t xml:space="preserve"> Explaining a question kills the tension.</w:t>
+      </w:r>
+    </w:p>
+    <w:p>
+      <w:pPr>
+        <w:pStyle w:val="ListParagraph"/>
+        <w:numPr>
+          <w:ilvl w:val="0"/>
+          <w:numId w:val="2"/>
+        </w:numPr>
+        <w:spacing w:after="60"/>
+      </w:pPr>
+      <w:r>
+        <w:rPr>
+          <w:rFonts w:ascii="Calibri" w:cs="Calibri" w:eastAsia="Calibri" w:hAnsi="Calibri"/>
+          <w:b/>
+          <w:bCs/>
+        </w:rPr>
+        <w:t xml:space="preserve">Spread the signature questions out,</w:t>
+      </w:r>
+      <w:r>
+        <w:rPr>
+          <w:rFonts w:ascii="Calibri" w:cs="Calibri" w:eastAsia="Calibri" w:hAnsi="Calibri"/>
+        </w:rPr>
+        <w:t xml:space="preserve"> with at most one per Act from Section 3, so the interview doesn't feel like an interrogation.</w:t>
       </w:r>
     </w:p>
     <w:sectPr>

</xml_diff>

<commit_message>
Add Sealed Letter closing ritual to Episode 1 interview plan
Co-Authored-By: Claude Opus 5.5 <noreply@anthropic.com>
Claude-Session: https://claude.ai/code/session_011JLPhNgkizAQQVaskFHXaY
</commit_message>
<xml_diff>
--- a/research-prompts/Episode-01-Siddharth-Rajsekar-Interview-Plan.docx
+++ b/research-prompts/Episode-01-Siddharth-Rajsekar-Interview-Plan.docx
@@ -334,7 +334,7 @@
             <w:pPr>
               <w:spacing w:after="0"/>
             </w:pPr>
-            <w:hyperlink w:history="1" r:id="rIdr805mncgcvdmwbqjppsqd">
+            <w:hyperlink w:history="1" r:id="rIdcibzwkptgamqsy8qu-sku">
               <w:r>
                 <w:rPr>
                   <w:rStyle w:val="Hyperlink"/>
@@ -469,7 +469,7 @@
             <w:pPr>
               <w:spacing w:after="0"/>
             </w:pPr>
-            <w:hyperlink w:history="1" r:id="rIdtmyd-qjdd0srfd6idpf5w">
+            <w:hyperlink w:history="1" r:id="rIdiqidmbyddn34ozqeyxwgq">
               <w:r>
                 <w:rPr>
                   <w:rStyle w:val="Hyperlink"/>
@@ -2533,8 +2533,16 @@
       <w:r>
         <w:rPr>
           <w:rFonts w:ascii="Calibri" w:cs="Calibri" w:eastAsia="Calibri" w:hAnsi="Calibri"/>
-        </w:rPr>
-        <w:t xml:space="preserve">"What would you tell </w:t>
+          <w:b/>
+          <w:bCs/>
+        </w:rPr>
+        <w:t xml:space="preserve">The closing ritual: see Section 10</w:t>
+      </w:r>
+      <w:r>
+        <w:rPr>
+          <w:rFonts w:ascii="Calibri" w:cs="Calibri" w:eastAsia="Calibri" w:hAnsi="Calibri"/>
+        </w:rPr>
+        <w:t xml:space="preserve"> (replaces the plain "What would you tell me?" question) → </w:t>
       </w:r>
       <w:r>
         <w:rPr>
@@ -2542,21 +2550,7 @@
           <w:i/>
           <w:iCs/>
         </w:rPr>
-        <w:t xml:space="preserve">me</w:t>
-      </w:r>
-      <w:r>
-        <w:rPr>
-          <w:rFonts w:ascii="Calibri" w:cs="Calibri" w:eastAsia="Calibri" w:hAnsi="Calibri"/>
-        </w:rPr>
-        <w:t xml:space="preserve"> as I start this series?" → </w:t>
-      </w:r>
-      <w:r>
-        <w:rPr>
-          <w:rFonts w:ascii="Calibri" w:cs="Calibri" w:eastAsia="Calibri" w:hAnsi="Calibri"/>
-          <w:i/>
-          <w:iCs/>
-        </w:rPr>
-        <w:t xml:space="preserve">mentor moment, emotional close</w:t>
+        <w:t xml:space="preserve">mentor moment, open loop</w:t>
       </w:r>
       <w:r>
         <w:rPr>
@@ -4502,6 +4496,1030 @@
           <w:rFonts w:ascii="Calibri" w:cs="Calibri" w:eastAsia="Calibri" w:hAnsi="Calibri"/>
         </w:rPr>
         <w:t xml:space="preserve"> with at most one per Act from Section 3, so the interview doesn't feel like an interrogation.</w:t>
+      </w:r>
+    </w:p>
+    <w:p>
+      <w:pPr>
+        <w:pStyle w:val="Heading1"/>
+      </w:pPr>
+      <w:r>
+        <w:t xml:space="preserve">10. The closing ritual: "The Sealed Letter"</w:t>
+      </w:r>
+    </w:p>
+    <w:p>
+      <w:pPr>
+        <w:spacing w:after="120"/>
+      </w:pPr>
+      <w:r>
+        <w:rPr>
+          <w:rFonts w:ascii="Calibri" w:cs="Calibri" w:eastAsia="Calibri" w:hAnsi="Calibri"/>
+        </w:rPr>
+        <w:t xml:space="preserve">"What would you tell me as I start this series?" is a good question, but every podcast asks some version of it. This closing turns it into a </w:t>
+      </w:r>
+      <w:r>
+        <w:rPr>
+          <w:rFonts w:ascii="Calibri" w:cs="Calibri" w:eastAsia="Calibri" w:hAnsi="Calibri"/>
+          <w:b/>
+          <w:bCs/>
+        </w:rPr>
+        <w:t xml:space="preserve">3-minute scene with a promise the audience waits for</w:t>
+      </w:r>
+      <w:r>
+        <w:rPr>
+          <w:rFonts w:ascii="Calibri" w:cs="Calibri" w:eastAsia="Calibri" w:hAnsi="Calibri"/>
+        </w:rPr>
+        <w:t xml:space="preserve">. It builds on SOHK's biggest retention lesson: create a challenge or a journey, so the viewer wants to know how it ends.</w:t>
+      </w:r>
+    </w:p>
+    <w:p>
+      <w:pPr>
+        <w:pStyle w:val="Heading2"/>
+      </w:pPr>
+      <w:r>
+        <w:t xml:space="preserve">The sequence (film it last, after the reversal question Q22)</w:t>
+      </w:r>
+    </w:p>
+    <w:p>
+      <w:pPr>
+        <w:spacing w:after="120"/>
+      </w:pPr>
+      <w:r>
+        <w:rPr>
+          <w:rFonts w:ascii="Calibri" w:cs="Calibri" w:eastAsia="Calibri" w:hAnsi="Calibri"/>
+          <w:b/>
+          <w:bCs/>
+        </w:rPr>
+        <w:t xml:space="preserve">Beat 1: The warning</w:t>
+      </w:r>
+      <w:r>
+        <w:rPr>
+          <w:rFonts w:ascii="Calibri" w:cs="Calibri" w:eastAsia="Calibri" w:hAnsi="Calibri"/>
+        </w:rPr>
+        <w:t xml:space="preserve"> </w:t>
+      </w:r>
+      <w:r>
+        <w:rPr>
+          <w:rFonts w:ascii="Calibri" w:cs="Calibri" w:eastAsia="Calibri" w:hAnsi="Calibri"/>
+          <w:i/>
+          <w:iCs/>
+        </w:rPr>
+        <w:t xml:space="preserve">(tension, 30–45 sec)</w:t>
+      </w:r>
+    </w:p>
+    <w:p>
+      <w:pPr>
+        <w:pBdr>
+          <w:left w:val="single" w:color="B8860B" w:sz="18" w:space="8"/>
+        </w:pBdr>
+        <w:ind w:left="360"/>
+      </w:pPr>
+      <w:r>
+        <w:rPr>
+          <w:rFonts w:ascii="Calibri" w:cs="Calibri" w:eastAsia="Calibri" w:hAnsi="Calibri"/>
+          <w:i/>
+          <w:iCs/>
+        </w:rPr>
+        <w:t xml:space="preserve">"Most mentors give advice. I want the opposite. *</w:t>
+      </w:r>
+      <w:r>
+        <w:rPr>
+          <w:rFonts w:ascii="Calibri" w:cs="Calibri" w:eastAsia="Calibri" w:hAnsi="Calibri"/>
+          <w:i/>
+          <w:iCs/>
+        </w:rPr>
+        <w:t xml:space="preserve">What's the mistake you're </w:t>
+      </w:r>
+      <w:r>
+        <w:rPr>
+          <w:rFonts w:ascii="Calibri" w:cs="Calibri" w:eastAsia="Calibri" w:hAnsi="Calibri"/>
+          <w:i/>
+          <w:iCs/>
+        </w:rPr>
+        <w:t xml:space="preserve">sure* I'm going to make?**"</w:t>
+      </w:r>
+    </w:p>
+    <w:p>
+      <w:pPr>
+        <w:spacing w:after="120"/>
+      </w:pPr>
+      <w:r>
+        <w:rPr>
+          <w:rFonts w:ascii="Calibri" w:cs="Calibri" w:eastAsia="Calibri" w:hAnsi="Calibri"/>
+        </w:rPr>
+        <w:t xml:space="preserve">This works better than "what's your advice" because a prediction has stakes. The audience will watch to see if he's right.</w:t>
+      </w:r>
+    </w:p>
+    <w:p>
+      <w:pPr>
+        <w:spacing w:after="120"/>
+      </w:pPr>
+      <w:r>
+        <w:rPr>
+          <w:rFonts w:ascii="Calibri" w:cs="Calibri" w:eastAsia="Calibri" w:hAnsi="Calibri"/>
+          <w:b/>
+          <w:bCs/>
+        </w:rPr>
+        <w:t xml:space="preserve">Beat 2: The guru dakshina</w:t>
+      </w:r>
+      <w:r>
+        <w:rPr>
+          <w:rFonts w:ascii="Calibri" w:cs="Calibri" w:eastAsia="Calibri" w:hAnsi="Calibri"/>
+        </w:rPr>
+        <w:t xml:space="preserve"> </w:t>
+      </w:r>
+      <w:r>
+        <w:rPr>
+          <w:rFonts w:ascii="Calibri" w:cs="Calibri" w:eastAsia="Calibri" w:hAnsi="Calibri"/>
+          <w:i/>
+          <w:iCs/>
+        </w:rPr>
+        <w:t xml:space="preserve">(meaning, 45–60 sec)</w:t>
+      </w:r>
+    </w:p>
+    <w:p>
+      <w:pPr>
+        <w:pBdr>
+          <w:left w:val="single" w:color="B8860B" w:sz="18" w:space="8"/>
+        </w:pBdr>
+        <w:ind w:left="360"/>
+      </w:pPr>
+      <w:r>
+        <w:rPr>
+          <w:rFonts w:ascii="Calibri" w:cs="Calibri" w:eastAsia="Calibri" w:hAnsi="Calibri"/>
+          <w:i/>
+          <w:iCs/>
+        </w:rPr>
+        <w:t xml:space="preserve">"In the Gurukul, the student offered dakshina when the learning was complete. You've taught me for [X years]. </w:t>
+      </w:r>
+      <w:r>
+        <w:rPr>
+          <w:rFonts w:ascii="Calibri" w:cs="Calibri" w:eastAsia="Calibri" w:hAnsi="Calibri"/>
+          <w:b/>
+          <w:bCs/>
+          <w:i/>
+          <w:iCs/>
+        </w:rPr>
+        <w:t xml:space="preserve">What dakshina do you want from me, and it can't be money?</w:t>
+      </w:r>
+      <w:r>
+        <w:rPr>
+          <w:rFonts w:ascii="Calibri" w:cs="Calibri" w:eastAsia="Calibri" w:hAnsi="Calibri"/>
+          <w:i/>
+          <w:iCs/>
+        </w:rPr>
+        <w:t xml:space="preserve">"</w:t>
+      </w:r>
+    </w:p>
+    <w:p>
+      <w:pPr>
+        <w:spacing w:after="120"/>
+      </w:pPr>
+      <w:r>
+        <w:rPr>
+          <w:rFonts w:ascii="Calibri" w:cs="Calibri" w:eastAsia="Calibri" w:hAnsi="Calibri"/>
+        </w:rPr>
+        <w:t xml:space="preserve">Whatever he asks for (e.g. "help 1,000 people use AI honestly"), </w:t>
+      </w:r>
+      <w:r>
+        <w:rPr>
+          <w:rFonts w:ascii="Calibri" w:cs="Calibri" w:eastAsia="Calibri" w:hAnsi="Calibri"/>
+          <w:b/>
+          <w:bCs/>
+        </w:rPr>
+        <w:t xml:space="preserve">accept it on camera</w:t>
+      </w:r>
+      <w:r>
+        <w:rPr>
+          <w:rFonts w:ascii="Calibri" w:cs="Calibri" w:eastAsia="Calibri" w:hAnsi="Calibri"/>
+        </w:rPr>
+        <w:t xml:space="preserve">: "Done. That's my promise." The mentor becomes a witness to your public vow, and it links back to signature question 1.</w:t>
+      </w:r>
+    </w:p>
+    <w:p>
+      <w:pPr>
+        <w:spacing w:after="120"/>
+      </w:pPr>
+      <w:r>
+        <w:rPr>
+          <w:rFonts w:ascii="Calibri" w:cs="Calibri" w:eastAsia="Calibri" w:hAnsi="Calibri"/>
+          <w:b/>
+          <w:bCs/>
+        </w:rPr>
+        <w:t xml:space="preserve">Beat 3: The sealed letter</w:t>
+      </w:r>
+      <w:r>
+        <w:rPr>
+          <w:rFonts w:ascii="Calibri" w:cs="Calibri" w:eastAsia="Calibri" w:hAnsi="Calibri"/>
+        </w:rPr>
+        <w:t xml:space="preserve"> </w:t>
+      </w:r>
+      <w:r>
+        <w:rPr>
+          <w:rFonts w:ascii="Calibri" w:cs="Calibri" w:eastAsia="Calibri" w:hAnsi="Calibri"/>
+          <w:i/>
+          <w:iCs/>
+        </w:rPr>
+        <w:t xml:space="preserve">(the open loop, 60–90 sec)</w:t>
+      </w:r>
+    </w:p>
+    <w:p>
+      <w:pPr>
+        <w:spacing w:after="120"/>
+      </w:pPr>
+      <w:r>
+        <w:rPr>
+          <w:rFonts w:ascii="Calibri" w:cs="Calibri" w:eastAsia="Calibri" w:hAnsi="Calibri"/>
+        </w:rPr>
+        <w:t xml:space="preserve">Take out a card, a pen and an envelope.</w:t>
+      </w:r>
+    </w:p>
+    <w:p>
+      <w:pPr>
+        <w:pBdr>
+          <w:left w:val="single" w:color="B8860B" w:sz="18" w:space="8"/>
+        </w:pBdr>
+        <w:ind w:left="360"/>
+      </w:pPr>
+      <w:r>
+        <w:rPr>
+          <w:rFonts w:ascii="Calibri" w:cs="Calibri" w:eastAsia="Calibri" w:hAnsi="Calibri"/>
+          <w:i/>
+          <w:iCs/>
+        </w:rPr>
+        <w:t xml:space="preserve">"One last thing. I'd like you to write me a note, something I'm only allowed to open </w:t>
+      </w:r>
+      <w:r>
+        <w:rPr>
+          <w:rFonts w:ascii="Calibri" w:cs="Calibri" w:eastAsia="Calibri" w:hAnsi="Calibri"/>
+          <w:b/>
+          <w:bCs/>
+          <w:i/>
+          <w:iCs/>
+        </w:rPr>
+        <w:t xml:space="preserve">on camera, at Episode 100</w:t>
+      </w:r>
+      <w:r>
+        <w:rPr>
+          <w:rFonts w:ascii="Calibri" w:cs="Calibri" w:eastAsia="Calibri" w:hAnsi="Calibri"/>
+          <w:i/>
+          <w:iCs/>
+        </w:rPr>
+        <w:t xml:space="preserve">. Don't tell me what it says."</w:t>
+      </w:r>
+    </w:p>
+    <w:p>
+      <w:pPr>
+        <w:pStyle w:val="ListParagraph"/>
+        <w:numPr>
+          <w:ilvl w:val="0"/>
+          <w:numId w:val="2"/>
+        </w:numPr>
+        <w:spacing w:after="60"/>
+      </w:pPr>
+      <w:r>
+        <w:rPr>
+          <w:rFonts w:ascii="Calibri" w:cs="Calibri" w:eastAsia="Calibri" w:hAnsi="Calibri"/>
+        </w:rPr>
+        <w:t xml:space="preserve">Film him writing in </w:t>
+      </w:r>
+      <w:r>
+        <w:rPr>
+          <w:rFonts w:ascii="Calibri" w:cs="Calibri" w:eastAsia="Calibri" w:hAnsi="Calibri"/>
+          <w:b/>
+          <w:bCs/>
+        </w:rPr>
+        <w:t xml:space="preserve">silence</w:t>
+      </w:r>
+      <w:r>
+        <w:rPr>
+          <w:rFonts w:ascii="Calibri" w:cs="Calibri" w:eastAsia="Calibri" w:hAnsi="Calibri"/>
+        </w:rPr>
+        <w:t xml:space="preserve">: a close-up of his hand, then his face thinking. No music until the envelope is sealed.</w:t>
+      </w:r>
+    </w:p>
+    <w:p>
+      <w:pPr>
+        <w:pStyle w:val="ListParagraph"/>
+        <w:numPr>
+          <w:ilvl w:val="0"/>
+          <w:numId w:val="2"/>
+        </w:numPr>
+        <w:spacing w:after="60"/>
+      </w:pPr>
+      <w:r>
+        <w:rPr>
+          <w:rFonts w:ascii="Calibri" w:cs="Calibri" w:eastAsia="Calibri" w:hAnsi="Calibri"/>
+        </w:rPr>
+        <w:t xml:space="preserve">He seals it and hands it to you. Ask just one thing: </w:t>
+      </w:r>
+      <w:r>
+        <w:rPr>
+          <w:rFonts w:ascii="Calibri" w:cs="Calibri" w:eastAsia="Calibri" w:hAnsi="Calibri"/>
+          <w:b/>
+          <w:bCs/>
+        </w:rPr>
+        <w:t xml:space="preserve">"Without telling me what's in it, why did you write that?"</w:t>
+      </w:r>
+    </w:p>
+    <w:p>
+      <w:pPr>
+        <w:pStyle w:val="ListParagraph"/>
+        <w:numPr>
+          <w:ilvl w:val="0"/>
+          <w:numId w:val="2"/>
+        </w:numPr>
+        <w:spacing w:after="60"/>
+      </w:pPr>
+      <w:r>
+        <w:rPr>
+          <w:rFonts w:ascii="Calibri" w:cs="Calibri" w:eastAsia="Calibri" w:hAnsi="Calibri"/>
+        </w:rPr>
+        <w:t xml:space="preserve">Final shot: you hold the envelope to the camera. On-screen text: </w:t>
+      </w:r>
+      <w:r>
+        <w:rPr>
+          <w:rFonts w:ascii="Calibri" w:cs="Calibri" w:eastAsia="Calibri" w:hAnsi="Calibri"/>
+          <w:b/>
+          <w:bCs/>
+        </w:rPr>
+        <w:t xml:space="preserve">"Opening this at Episode 100."</w:t>
+      </w:r>
+    </w:p>
+    <w:p>
+      <w:pPr>
+        <w:spacing w:after="120"/>
+      </w:pPr>
+      <w:r>
+        <w:rPr>
+          <w:rFonts w:ascii="Calibri" w:cs="Calibri" w:eastAsia="Calibri" w:hAnsi="Calibri"/>
+          <w:b/>
+          <w:bCs/>
+        </w:rPr>
+        <w:t xml:space="preserve">End card (voiceover):</w:t>
+      </w:r>
+      <w:r>
+        <w:rPr>
+          <w:rFonts w:ascii="Calibri" w:cs="Calibri" w:eastAsia="Calibri" w:hAnsi="Calibri"/>
+        </w:rPr>
+        <w:t xml:space="preserve"> </w:t>
+      </w:r>
+      <w:r>
+        <w:rPr>
+          <w:rFonts w:ascii="Calibri" w:cs="Calibri" w:eastAsia="Calibri" w:hAnsi="Calibri"/>
+          <w:i/>
+          <w:iCs/>
+        </w:rPr>
+        <w:t xml:space="preserve">"Episode 1. 99 to go. Let's see if he was right."</w:t>
+      </w:r>
+    </w:p>
+    <w:p>
+      <w:pPr>
+        <w:pStyle w:val="Heading2"/>
+      </w:pPr>
+      <w:r>
+        <w:t xml:space="preserve">Why this ending works</w:t>
+      </w:r>
+    </w:p>
+    <w:tbl>
+      <w:tblPr>
+        <w:tblW w:type="dxa" w:w="9638"/>
+        <w:tblBorders>
+          <w:top w:val="single" w:color="auto" w:sz="4"/>
+          <w:left w:val="single" w:color="auto" w:sz="4"/>
+          <w:bottom w:val="single" w:color="auto" w:sz="4"/>
+          <w:right w:val="single" w:color="auto" w:sz="4"/>
+          <w:insideH w:val="single" w:color="auto" w:sz="4"/>
+          <w:insideV w:val="single" w:color="auto" w:sz="4"/>
+        </w:tblBorders>
+      </w:tblPr>
+      <w:tblGrid>
+        <w:gridCol w:w="4819"/>
+        <w:gridCol w:w="4819"/>
+      </w:tblGrid>
+      <w:tr>
+        <w:trPr>
+          <w:tblHeader/>
+        </w:trPr>
+        <w:tc>
+          <w:tcPr>
+            <w:tcW w:type="dxa" w:w="4819"/>
+            <w:tcBorders>
+              <w:top w:val="single" w:color="BFC8D6" w:sz="4"/>
+              <w:left w:val="single" w:color="BFC8D6" w:sz="4"/>
+              <w:bottom w:val="single" w:color="BFC8D6" w:sz="4"/>
+              <w:right w:val="single" w:color="BFC8D6" w:sz="4"/>
+            </w:tcBorders>
+            <w:shd w:fill="1F3A5F" w:color="auto" w:val="clear"/>
+            <w:tcMar>
+              <w:top w:type="dxa" w:w="60"/>
+              <w:left w:type="dxa" w:w="90"/>
+              <w:bottom w:type="dxa" w:w="60"/>
+              <w:right w:type="dxa" w:w="90"/>
+            </w:tcMar>
+          </w:tcPr>
+          <w:p>
+            <w:pPr>
+              <w:spacing w:after="0"/>
+            </w:pPr>
+            <w:r>
+              <w:rPr>
+                <w:rFonts w:ascii="Calibri" w:cs="Calibri" w:eastAsia="Calibri" w:hAnsi="Calibri"/>
+                <w:b/>
+                <w:bCs/>
+                <w:color w:val="FFFFFF"/>
+                <w:sz w:val="18"/>
+                <w:szCs w:val="18"/>
+              </w:rPr>
+              <w:t xml:space="preserve">Principle</w:t>
+            </w:r>
+          </w:p>
+        </w:tc>
+        <w:tc>
+          <w:tcPr>
+            <w:tcW w:type="dxa" w:w="4819"/>
+            <w:tcBorders>
+              <w:top w:val="single" w:color="BFC8D6" w:sz="4"/>
+              <w:left w:val="single" w:color="BFC8D6" w:sz="4"/>
+              <w:bottom w:val="single" w:color="BFC8D6" w:sz="4"/>
+              <w:right w:val="single" w:color="BFC8D6" w:sz="4"/>
+            </w:tcBorders>
+            <w:shd w:fill="1F3A5F" w:color="auto" w:val="clear"/>
+            <w:tcMar>
+              <w:top w:type="dxa" w:w="60"/>
+              <w:left w:type="dxa" w:w="90"/>
+              <w:bottom w:type="dxa" w:w="60"/>
+              <w:right w:type="dxa" w:w="90"/>
+            </w:tcMar>
+          </w:tcPr>
+          <w:p>
+            <w:pPr>
+              <w:spacing w:after="0"/>
+            </w:pPr>
+            <w:r>
+              <w:rPr>
+                <w:rFonts w:ascii="Calibri" w:cs="Calibri" w:eastAsia="Calibri" w:hAnsi="Calibri"/>
+                <w:b/>
+                <w:bCs/>
+                <w:color w:val="FFFFFF"/>
+                <w:sz w:val="18"/>
+                <w:szCs w:val="18"/>
+              </w:rPr>
+              <w:t xml:space="preserve">How the ritual uses it</w:t>
+            </w:r>
+          </w:p>
+        </w:tc>
+      </w:tr>
+      <w:tr>
+        <w:trPr>
+          <w:tblHeader w:val="false"/>
+        </w:trPr>
+        <w:tc>
+          <w:tcPr>
+            <w:tcW w:type="dxa" w:w="4819"/>
+            <w:tcBorders>
+              <w:top w:val="single" w:color="BFC8D6" w:sz="4"/>
+              <w:left w:val="single" w:color="BFC8D6" w:sz="4"/>
+              <w:bottom w:val="single" w:color="BFC8D6" w:sz="4"/>
+              <w:right w:val="single" w:color="BFC8D6" w:sz="4"/>
+            </w:tcBorders>
+            <w:tcMar>
+              <w:top w:type="dxa" w:w="60"/>
+              <w:left w:type="dxa" w:w="90"/>
+              <w:bottom w:type="dxa" w:w="60"/>
+              <w:right w:type="dxa" w:w="90"/>
+            </w:tcMar>
+          </w:tcPr>
+          <w:p>
+            <w:pPr>
+              <w:spacing w:after="0"/>
+            </w:pPr>
+            <w:r>
+              <w:rPr>
+                <w:rFonts w:ascii="Calibri" w:cs="Calibri" w:eastAsia="Calibri" w:hAnsi="Calibri"/>
+                <w:b/>
+                <w:bCs/>
+                <w:sz w:val="18"/>
+                <w:szCs w:val="18"/>
+              </w:rPr>
+              <w:t xml:space="preserve">Curiosity gap</w:t>
+            </w:r>
+            <w:r>
+              <w:rPr>
+                <w:rFonts w:ascii="Calibri" w:cs="Calibri" w:eastAsia="Calibri" w:hAnsi="Calibri"/>
+                <w:sz w:val="18"/>
+                <w:szCs w:val="18"/>
+              </w:rPr>
+              <w:t xml:space="preserve"> (Loewenstein)</w:t>
+            </w:r>
+          </w:p>
+        </w:tc>
+        <w:tc>
+          <w:tcPr>
+            <w:tcW w:type="dxa" w:w="4819"/>
+            <w:tcBorders>
+              <w:top w:val="single" w:color="BFC8D6" w:sz="4"/>
+              <w:left w:val="single" w:color="BFC8D6" w:sz="4"/>
+              <w:bottom w:val="single" w:color="BFC8D6" w:sz="4"/>
+              <w:right w:val="single" w:color="BFC8D6" w:sz="4"/>
+            </w:tcBorders>
+            <w:tcMar>
+              <w:top w:type="dxa" w:w="60"/>
+              <w:left w:type="dxa" w:w="90"/>
+              <w:bottom w:type="dxa" w:w="60"/>
+              <w:right w:type="dxa" w:w="90"/>
+            </w:tcMar>
+          </w:tcPr>
+          <w:p>
+            <w:pPr>
+              <w:spacing w:after="0"/>
+            </w:pPr>
+            <w:r>
+              <w:rPr>
+                <w:rFonts w:ascii="Calibri" w:cs="Calibri" w:eastAsia="Calibri" w:hAnsi="Calibri"/>
+                <w:sz w:val="18"/>
+                <w:szCs w:val="18"/>
+              </w:rPr>
+              <w:t xml:space="preserve">The unread letter is a question left open for the whole series</w:t>
+            </w:r>
+          </w:p>
+        </w:tc>
+      </w:tr>
+      <w:tr>
+        <w:trPr>
+          <w:tblHeader w:val="false"/>
+        </w:trPr>
+        <w:tc>
+          <w:tcPr>
+            <w:tcW w:type="dxa" w:w="4819"/>
+            <w:tcBorders>
+              <w:top w:val="single" w:color="BFC8D6" w:sz="4"/>
+              <w:left w:val="single" w:color="BFC8D6" w:sz="4"/>
+              <w:bottom w:val="single" w:color="BFC8D6" w:sz="4"/>
+              <w:right w:val="single" w:color="BFC8D6" w:sz="4"/>
+            </w:tcBorders>
+            <w:shd w:fill="EEF2F7" w:color="auto" w:val="clear"/>
+            <w:tcMar>
+              <w:top w:type="dxa" w:w="60"/>
+              <w:left w:type="dxa" w:w="90"/>
+              <w:bottom w:type="dxa" w:w="60"/>
+              <w:right w:type="dxa" w:w="90"/>
+            </w:tcMar>
+          </w:tcPr>
+          <w:p>
+            <w:pPr>
+              <w:spacing w:after="0"/>
+            </w:pPr>
+            <w:r>
+              <w:rPr>
+                <w:rFonts w:ascii="Calibri" w:cs="Calibri" w:eastAsia="Calibri" w:hAnsi="Calibri"/>
+                <w:b/>
+                <w:bCs/>
+                <w:sz w:val="18"/>
+                <w:szCs w:val="18"/>
+              </w:rPr>
+              <w:t xml:space="preserve">Journey + challenge</w:t>
+            </w:r>
+            <w:r>
+              <w:rPr>
+                <w:rFonts w:ascii="Calibri" w:cs="Calibri" w:eastAsia="Calibri" w:hAnsi="Calibri"/>
+                <w:sz w:val="18"/>
+                <w:szCs w:val="18"/>
+              </w:rPr>
+              <w:t xml:space="preserve"> (SOHK's YouTube lesson)</w:t>
+            </w:r>
+          </w:p>
+        </w:tc>
+        <w:tc>
+          <w:tcPr>
+            <w:tcW w:type="dxa" w:w="4819"/>
+            <w:tcBorders>
+              <w:top w:val="single" w:color="BFC8D6" w:sz="4"/>
+              <w:left w:val="single" w:color="BFC8D6" w:sz="4"/>
+              <w:bottom w:val="single" w:color="BFC8D6" w:sz="4"/>
+              <w:right w:val="single" w:color="BFC8D6" w:sz="4"/>
+            </w:tcBorders>
+            <w:shd w:fill="EEF2F7" w:color="auto" w:val="clear"/>
+            <w:tcMar>
+              <w:top w:type="dxa" w:w="60"/>
+              <w:left w:type="dxa" w:w="90"/>
+              <w:bottom w:type="dxa" w:w="60"/>
+              <w:right w:type="dxa" w:w="90"/>
+            </w:tcMar>
+          </w:tcPr>
+          <w:p>
+            <w:pPr>
+              <w:spacing w:after="0"/>
+            </w:pPr>
+            <w:r>
+              <w:rPr>
+                <w:rFonts w:ascii="Calibri" w:cs="Calibri" w:eastAsia="Calibri" w:hAnsi="Calibri"/>
+                <w:sz w:val="18"/>
+                <w:szCs w:val="18"/>
+              </w:rPr>
+              <w:t xml:space="preserve">"99 to go" turns a single video into a story with an ending</w:t>
+            </w:r>
+          </w:p>
+        </w:tc>
+      </w:tr>
+      <w:tr>
+        <w:trPr>
+          <w:tblHeader w:val="false"/>
+        </w:trPr>
+        <w:tc>
+          <w:tcPr>
+            <w:tcW w:type="dxa" w:w="4819"/>
+            <w:tcBorders>
+              <w:top w:val="single" w:color="BFC8D6" w:sz="4"/>
+              <w:left w:val="single" w:color="BFC8D6" w:sz="4"/>
+              <w:bottom w:val="single" w:color="BFC8D6" w:sz="4"/>
+              <w:right w:val="single" w:color="BFC8D6" w:sz="4"/>
+            </w:tcBorders>
+            <w:tcMar>
+              <w:top w:type="dxa" w:w="60"/>
+              <w:left w:type="dxa" w:w="90"/>
+              <w:bottom w:type="dxa" w:w="60"/>
+              <w:right w:type="dxa" w:w="90"/>
+            </w:tcMar>
+          </w:tcPr>
+          <w:p>
+            <w:pPr>
+              <w:spacing w:after="0"/>
+            </w:pPr>
+            <w:r>
+              <w:rPr>
+                <w:rFonts w:ascii="Calibri" w:cs="Calibri" w:eastAsia="Calibri" w:hAnsi="Calibri"/>
+                <w:b/>
+                <w:bCs/>
+                <w:sz w:val="18"/>
+                <w:szCs w:val="18"/>
+              </w:rPr>
+              <w:t xml:space="preserve">Stakes</w:t>
+            </w:r>
+          </w:p>
+        </w:tc>
+        <w:tc>
+          <w:tcPr>
+            <w:tcW w:type="dxa" w:w="4819"/>
+            <w:tcBorders>
+              <w:top w:val="single" w:color="BFC8D6" w:sz="4"/>
+              <w:left w:val="single" w:color="BFC8D6" w:sz="4"/>
+              <w:bottom w:val="single" w:color="BFC8D6" w:sz="4"/>
+              <w:right w:val="single" w:color="BFC8D6" w:sz="4"/>
+            </w:tcBorders>
+            <w:tcMar>
+              <w:top w:type="dxa" w:w="60"/>
+              <w:left w:type="dxa" w:w="90"/>
+              <w:bottom w:type="dxa" w:w="60"/>
+              <w:right w:type="dxa" w:w="90"/>
+            </w:tcMar>
+          </w:tcPr>
+          <w:p>
+            <w:pPr>
+              <w:spacing w:after="0"/>
+            </w:pPr>
+            <w:r>
+              <w:rPr>
+                <w:rFonts w:ascii="Calibri" w:cs="Calibri" w:eastAsia="Calibri" w:hAnsi="Calibri"/>
+                <w:sz w:val="18"/>
+                <w:szCs w:val="18"/>
+              </w:rPr>
+              <w:t xml:space="preserve">His prediction (Beat 1) and your vow (Beat 2) give viewers something to hold you to</w:t>
+            </w:r>
+          </w:p>
+        </w:tc>
+      </w:tr>
+      <w:tr>
+        <w:trPr>
+          <w:tblHeader w:val="false"/>
+        </w:trPr>
+        <w:tc>
+          <w:tcPr>
+            <w:tcW w:type="dxa" w:w="4819"/>
+            <w:tcBorders>
+              <w:top w:val="single" w:color="BFC8D6" w:sz="4"/>
+              <w:left w:val="single" w:color="BFC8D6" w:sz="4"/>
+              <w:bottom w:val="single" w:color="BFC8D6" w:sz="4"/>
+              <w:right w:val="single" w:color="BFC8D6" w:sz="4"/>
+            </w:tcBorders>
+            <w:shd w:fill="EEF2F7" w:color="auto" w:val="clear"/>
+            <w:tcMar>
+              <w:top w:type="dxa" w:w="60"/>
+              <w:left w:type="dxa" w:w="90"/>
+              <w:bottom w:type="dxa" w:w="60"/>
+              <w:right w:type="dxa" w:w="90"/>
+            </w:tcMar>
+          </w:tcPr>
+          <w:p>
+            <w:pPr>
+              <w:spacing w:after="0"/>
+            </w:pPr>
+            <w:r>
+              <w:rPr>
+                <w:rFonts w:ascii="Calibri" w:cs="Calibri" w:eastAsia="Calibri" w:hAnsi="Calibri"/>
+                <w:b/>
+                <w:bCs/>
+                <w:sz w:val="18"/>
+                <w:szCs w:val="18"/>
+              </w:rPr>
+              <w:t xml:space="preserve">Cultural resonance</w:t>
+            </w:r>
+          </w:p>
+        </w:tc>
+        <w:tc>
+          <w:tcPr>
+            <w:tcW w:type="dxa" w:w="4819"/>
+            <w:tcBorders>
+              <w:top w:val="single" w:color="BFC8D6" w:sz="4"/>
+              <w:left w:val="single" w:color="BFC8D6" w:sz="4"/>
+              <w:bottom w:val="single" w:color="BFC8D6" w:sz="4"/>
+              <w:right w:val="single" w:color="BFC8D6" w:sz="4"/>
+            </w:tcBorders>
+            <w:shd w:fill="EEF2F7" w:color="auto" w:val="clear"/>
+            <w:tcMar>
+              <w:top w:type="dxa" w:w="60"/>
+              <w:left w:type="dxa" w:w="90"/>
+              <w:bottom w:type="dxa" w:w="60"/>
+              <w:right w:type="dxa" w:w="90"/>
+            </w:tcMar>
+          </w:tcPr>
+          <w:p>
+            <w:pPr>
+              <w:spacing w:after="0"/>
+            </w:pPr>
+            <w:r>
+              <w:rPr>
+                <w:rFonts w:ascii="Calibri" w:cs="Calibri" w:eastAsia="Calibri" w:hAnsi="Calibri"/>
+                <w:sz w:val="18"/>
+                <w:szCs w:val="18"/>
+              </w:rPr>
+              <w:t xml:space="preserve">Guru dakshina is instantly understood in India, and it's your AI × Dharma brand at its best</w:t>
+            </w:r>
+          </w:p>
+        </w:tc>
+      </w:tr>
+      <w:tr>
+        <w:trPr>
+          <w:tblHeader w:val="false"/>
+        </w:trPr>
+        <w:tc>
+          <w:tcPr>
+            <w:tcW w:type="dxa" w:w="4819"/>
+            <w:tcBorders>
+              <w:top w:val="single" w:color="BFC8D6" w:sz="4"/>
+              <w:left w:val="single" w:color="BFC8D6" w:sz="4"/>
+              <w:bottom w:val="single" w:color="BFC8D6" w:sz="4"/>
+              <w:right w:val="single" w:color="BFC8D6" w:sz="4"/>
+            </w:tcBorders>
+            <w:tcMar>
+              <w:top w:type="dxa" w:w="60"/>
+              <w:left w:type="dxa" w:w="90"/>
+              <w:bottom w:type="dxa" w:w="60"/>
+              <w:right w:type="dxa" w:w="90"/>
+            </w:tcMar>
+          </w:tcPr>
+          <w:p>
+            <w:pPr>
+              <w:spacing w:after="0"/>
+            </w:pPr>
+            <w:r>
+              <w:rPr>
+                <w:rFonts w:ascii="Calibri" w:cs="Calibri" w:eastAsia="Calibri" w:hAnsi="Calibri"/>
+                <w:b/>
+                <w:bCs/>
+                <w:sz w:val="18"/>
+                <w:szCs w:val="18"/>
+              </w:rPr>
+              <w:t xml:space="preserve">Easy to share</w:t>
+            </w:r>
+          </w:p>
+        </w:tc>
+        <w:tc>
+          <w:tcPr>
+            <w:tcW w:type="dxa" w:w="4819"/>
+            <w:tcBorders>
+              <w:top w:val="single" w:color="BFC8D6" w:sz="4"/>
+              <w:left w:val="single" w:color="BFC8D6" w:sz="4"/>
+              <w:bottom w:val="single" w:color="BFC8D6" w:sz="4"/>
+              <w:right w:val="single" w:color="BFC8D6" w:sz="4"/>
+            </w:tcBorders>
+            <w:tcMar>
+              <w:top w:type="dxa" w:w="60"/>
+              <w:left w:type="dxa" w:w="90"/>
+              <w:bottom w:type="dxa" w:w="60"/>
+              <w:right w:type="dxa" w:w="90"/>
+            </w:tcMar>
+          </w:tcPr>
+          <w:p>
+            <w:pPr>
+              <w:spacing w:after="0"/>
+            </w:pPr>
+            <w:r>
+              <w:rPr>
+                <w:rFonts w:ascii="Calibri" w:cs="Calibri" w:eastAsia="Calibri" w:hAnsi="Calibri"/>
+                <w:sz w:val="18"/>
+                <w:szCs w:val="18"/>
+              </w:rPr>
+              <w:t xml:space="preserve">"My mentor wrote me a letter I can't open for 99 episodes" is a Short that will likely spread by itself</w:t>
+            </w:r>
+          </w:p>
+        </w:tc>
+      </w:tr>
+    </w:tbl>
+    <w:p>
+      <w:pPr>
+        <w:spacing w:after="120"/>
+      </w:pPr>
+    </w:p>
+    <w:p>
+      <w:pPr>
+        <w:pStyle w:val="Heading2"/>
+      </w:pPr>
+      <w:r>
+        <w:t xml:space="preserve">Shorts from this scene</w:t>
+      </w:r>
+    </w:p>
+    <w:p>
+      <w:pPr>
+        <w:pStyle w:val="ListParagraph"/>
+        <w:numPr>
+          <w:ilvl w:val="0"/>
+          <w:numId w:val="2"/>
+        </w:numPr>
+        <w:spacing w:after="60"/>
+      </w:pPr>
+      <w:r>
+        <w:rPr>
+          <w:rFonts w:ascii="Calibri" w:cs="Calibri" w:eastAsia="Calibri" w:hAnsi="Calibri"/>
+        </w:rPr>
+        <w:t xml:space="preserve">"My Mentor Wrote Me a Letter I Can't Open Until Episode 100"</w:t>
+      </w:r>
+    </w:p>
+    <w:p>
+      <w:pPr>
+        <w:pStyle w:val="ListParagraph"/>
+        <w:numPr>
+          <w:ilvl w:val="0"/>
+          <w:numId w:val="2"/>
+        </w:numPr>
+        <w:spacing w:after="60"/>
+      </w:pPr>
+      <w:r>
+        <w:rPr>
+          <w:rFonts w:ascii="Calibri" w:cs="Calibri" w:eastAsia="Calibri" w:hAnsi="Calibri"/>
+        </w:rPr>
+        <w:t xml:space="preserve">"I Asked My Mentor What Mistake I'll Make. His Answer Scared Me" </w:t>
+      </w:r>
+      <w:r>
+        <w:rPr>
+          <w:rFonts w:ascii="Calibri" w:cs="Calibri" w:eastAsia="Calibri" w:hAnsi="Calibri"/>
+          <w:i/>
+          <w:iCs/>
+        </w:rPr>
+        <w:t xml:space="preserve">(use only if the answer really is strong)</w:t>
+      </w:r>
+    </w:p>
+    <w:p>
+      <w:pPr>
+        <w:pStyle w:val="ListParagraph"/>
+        <w:numPr>
+          <w:ilvl w:val="0"/>
+          <w:numId w:val="2"/>
+        </w:numPr>
+        <w:spacing w:after="60"/>
+      </w:pPr>
+      <w:r>
+        <w:rPr>
+          <w:rFonts w:ascii="Calibri" w:cs="Calibri" w:eastAsia="Calibri" w:hAnsi="Calibri"/>
+        </w:rPr>
+        <w:t xml:space="preserve">"He Asked for Guru Dakshina, and It Wasn't Money"</w:t>
+      </w:r>
+    </w:p>
+    <w:p>
+      <w:pPr>
+        <w:pStyle w:val="Heading2"/>
+      </w:pPr>
+      <w:r>
+        <w:t xml:space="preserve">Production notes</w:t>
+      </w:r>
+    </w:p>
+    <w:p>
+      <w:pPr>
+        <w:pStyle w:val="ListParagraph"/>
+        <w:numPr>
+          <w:ilvl w:val="0"/>
+          <w:numId w:val="2"/>
+        </w:numPr>
+        <w:spacing w:after="60"/>
+      </w:pPr>
+      <w:r>
+        <w:rPr>
+          <w:rFonts w:ascii="Calibri" w:cs="Calibri" w:eastAsia="Calibri" w:hAnsi="Calibri"/>
+          <w:b/>
+          <w:bCs/>
+        </w:rPr>
+        <w:t xml:space="preserve">Get his agreement without spoiling it:</w:t>
+      </w:r>
+      <w:r>
+        <w:rPr>
+          <w:rFonts w:ascii="Calibri" w:cs="Calibri" w:eastAsia="Calibri" w:hAnsi="Calibri"/>
+        </w:rPr>
+        <w:t xml:space="preserve"> before the shoot, tell him "there's a small closing ritual that involves writing a note" so he isn't caught off guard, but don't give him the details.</w:t>
+      </w:r>
+    </w:p>
+    <w:p>
+      <w:pPr>
+        <w:pStyle w:val="ListParagraph"/>
+        <w:numPr>
+          <w:ilvl w:val="0"/>
+          <w:numId w:val="2"/>
+        </w:numPr>
+        <w:spacing w:after="60"/>
+      </w:pPr>
+      <w:r>
+        <w:rPr>
+          <w:rFonts w:ascii="Calibri" w:cs="Calibri" w:eastAsia="Calibri" w:hAnsi="Calibri"/>
+          <w:b/>
+          <w:bCs/>
+        </w:rPr>
+        <w:t xml:space="preserve">Props:</w:t>
+      </w:r>
+      <w:r>
+        <w:rPr>
+          <w:rFonts w:ascii="Calibri" w:cs="Calibri" w:eastAsia="Calibri" w:hAnsi="Calibri"/>
+        </w:rPr>
+        <w:t xml:space="preserve"> a good-quality card and envelope, ideally with your aiwithsid wax seal or logo. Keep it in a visible place in your future videos as a recurring visual reminder.</w:t>
+      </w:r>
+    </w:p>
+    <w:p>
+      <w:pPr>
+        <w:pStyle w:val="ListParagraph"/>
+        <w:numPr>
+          <w:ilvl w:val="0"/>
+          <w:numId w:val="2"/>
+        </w:numPr>
+        <w:spacing w:after="60"/>
+      </w:pPr>
+      <w:r>
+        <w:rPr>
+          <w:rFonts w:ascii="Calibri" w:cs="Calibri" w:eastAsia="Calibri" w:hAnsi="Calibri"/>
+          <w:b/>
+          <w:bCs/>
+        </w:rPr>
+        <w:t xml:space="preserve">Film the handover with 2 cameras</w:t>
+      </w:r>
+      <w:r>
+        <w:rPr>
+          <w:rFonts w:ascii="Calibri" w:cs="Calibri" w:eastAsia="Calibri" w:hAnsi="Calibri"/>
+        </w:rPr>
+        <w:t xml:space="preserve"> (hands close-up and a wide shot).</w:t>
+      </w:r>
+    </w:p>
+    <w:p>
+      <w:pPr>
+        <w:pStyle w:val="ListParagraph"/>
+        <w:numPr>
+          <w:ilvl w:val="0"/>
+          <w:numId w:val="2"/>
+        </w:numPr>
+        <w:spacing w:after="60"/>
+      </w:pPr>
+      <w:r>
+        <w:rPr>
+          <w:rFonts w:ascii="Calibri" w:cs="Calibri" w:eastAsia="Calibri" w:hAnsi="Calibri"/>
+          <w:b/>
+          <w:bCs/>
+        </w:rPr>
+        <w:t xml:space="preserve">Fallback if he doesn't want to write:</w:t>
+      </w:r>
+      <w:r>
+        <w:rPr>
+          <w:rFonts w:ascii="Calibri" w:cs="Calibri" w:eastAsia="Calibri" w:hAnsi="Calibri"/>
+        </w:rPr>
+        <w:t xml:space="preserve"> ask him to record a 30-second voice note on your phone that you won't play until Episode 100.</w:t>
+      </w:r>
+    </w:p>
+    <w:p>
+      <w:pPr>
+        <w:pStyle w:val="ListParagraph"/>
+        <w:numPr>
+          <w:ilvl w:val="0"/>
+          <w:numId w:val="2"/>
+        </w:numPr>
+        <w:spacing w:after="60"/>
+      </w:pPr>
+      <w:r>
+        <w:rPr>
+          <w:rFonts w:ascii="Calibri" w:cs="Calibri" w:eastAsia="Calibri" w:hAnsi="Calibri"/>
+          <w:b/>
+          <w:bCs/>
+        </w:rPr>
+        <w:t xml:space="preserve">Keep the promise.</w:t>
+      </w:r>
+      <w:r>
+        <w:rPr>
+          <w:rFonts w:ascii="Calibri" w:cs="Calibri" w:eastAsia="Calibri" w:hAnsi="Calibri"/>
+        </w:rPr>
+        <w:t xml:space="preserve"> Store the envelope safely and actually open it at Episode 100. That future episode becomes an event in its own right, and you can invite him back to open it with you.</w:t>
       </w:r>
     </w:p>
     <w:sectPr>

</xml_diff>